<commit_message>
seminar4 + small adjustments
</commit_message>
<xml_diff>
--- a/docs/seminar_2/seminar_2.docx
+++ b/docs/seminar_2/seminar_2.docx
@@ -20,22 +20,6 @@
           <w:b/>
           <w:bCs/>
         </w:rPr>
-        <w:t xml:space="preserve">Тема:</w:t>
-      </w:r>
-      <w:r>
-        <w:t xml:space="preserve"> </w:t>
-      </w:r>
-      <w:r>
-        <w:t xml:space="preserve">Scrum, Kanban и организация потока задач: backlog, статусы, ответственность, правила командной работы.</w:t>
-      </w:r>
-      <w:r>
-        <w:br/>
-      </w:r>
-      <w:r>
-        <w:rPr>
-          <w:b/>
-          <w:bCs/>
-        </w:rPr>
         <w:t xml:space="preserve">Цель:</w:t>
       </w:r>
       <w:r>
@@ -43,64 +27,6 @@
       </w:r>
       <w:r>
         <w:t xml:space="preserve">перевести идею проекта из общей постановки в управляемый набор работ и настроить единый процесс, по которому команда будет работать весь семестр.</w:t>
-      </w:r>
-      <w:r>
-        <w:br/>
-      </w:r>
-      <w:r>
-        <w:rPr>
-          <w:b/>
-          <w:bCs/>
-        </w:rPr>
-        <w:t xml:space="preserve">Дисциплина:</w:t>
-      </w:r>
-      <w:r>
-        <w:t xml:space="preserve"> </w:t>
-      </w:r>
-      <w:r>
-        <w:t xml:space="preserve">«Программная инженерия» (профиль «Инженерия данных», 3 курс, 5-й семестр)</w:t>
-      </w:r>
-      <w:r>
-        <w:br/>
-      </w:r>
-      <w:r>
-        <w:rPr>
-          <w:b/>
-          <w:bCs/>
-        </w:rPr>
-        <w:t xml:space="preserve">Команда:</w:t>
-      </w:r>
-      <w:r>
-        <w:t xml:space="preserve"> </w:t>
-      </w:r>
-      <w:r>
-        <w:t xml:space="preserve">«Шпингалеты» (</w:t>
-      </w:r>
-      <w:r>
-        <w:rPr>
-          <w:i/>
-          <w:iCs/>
-        </w:rPr>
-        <w:t xml:space="preserve">Shpingalets</w:t>
-      </w:r>
-      <w:r>
-        <w:t xml:space="preserve">)</w:t>
-      </w:r>
-      <w:r>
-        <w:br/>
-      </w:r>
-      <w:r>
-        <w:rPr>
-          <w:b/>
-          <w:bCs/>
-        </w:rPr>
-        <w:t xml:space="preserve">Проект:</w:t>
-      </w:r>
-      <w:r>
-        <w:t xml:space="preserve"> </w:t>
-      </w:r>
-      <w:r>
-        <w:t xml:space="preserve">EcoGrid Flow</w:t>
       </w:r>
     </w:p>
     <w:p>
@@ -134,20 +60,6 @@
         <w:tblW w:type="pct" w:w="5000"/>
         <w:tblLayout w:type="fixed"/>
         <w:tblLook w:firstRow="1" w:lastRow="0" w:firstColumn="0" w:lastColumn="0" w:noHBand="0" w:noVBand="0" w:val="0020"/>
-        <w:tblBorders>
-          <w:top w:val="single" w:sz="4" w:space="0" w:color="D0D7DE"/>
-          <w:left w:val="single" w:sz="4" w:space="0" w:color="D0D7DE"/>
-          <w:bottom w:val="single" w:sz="4" w:space="0" w:color="D0D7DE"/>
-          <w:right w:val="single" w:sz="4" w:space="0" w:color="D0D7DE"/>
-          <w:insideH w:val="single" w:sz="4" w:space="0" w:color="D0D7DE"/>
-          <w:insideV w:val="single" w:sz="4" w:space="0" w:color="D0D7DE"/>
-        </w:tblBorders>
-        <w:tblCellMar>
-          <w:top w:w="120" w:type="dxa"/>
-          <w:bottom w:w="120" w:type="dxa"/>
-          <w:left w:w="160" w:type="dxa"/>
-          <w:right w:w="160" w:type="dxa"/>
-        </w:tblCellMar>
       </w:tblPr>
       <w:tblGrid>
         <w:gridCol w:w="1980"/>
@@ -158,85 +70,57 @@
       <w:tr>
         <w:trPr>
           <w:tblHeader w:val="on"/>
-          <w:cantSplit/>
         </w:trPr>
         <w:tc>
-          <w:tcPr>
-            <w:shd w:val="clear" w:color="auto" w:fill="F2F4F8"/>
-          </w:tcPr>
-          <w:p>
-            <w:pPr>
-              <w:pStyle w:val="Compact"/>
-              <w:jc w:val="left"/>
-            </w:pPr>
-            <w:r>
-              <w:rPr>
-                <w:b/>
-                <w:color w:val="24292F"/>
-              </w:rPr>
+          <w:tcPr/>
+          <w:p>
+            <w:pPr>
+              <w:pStyle w:val="Compact"/>
+              <w:jc w:val="left"/>
+            </w:pPr>
+            <w:r>
               <w:t xml:space="preserve">Критерий</w:t>
             </w:r>
           </w:p>
         </w:tc>
         <w:tc>
-          <w:tcPr>
-            <w:shd w:val="clear" w:color="auto" w:fill="F2F4F8"/>
-          </w:tcPr>
-          <w:p>
-            <w:pPr>
-              <w:pStyle w:val="Compact"/>
-              <w:jc w:val="left"/>
-            </w:pPr>
-            <w:r>
-              <w:rPr>
-                <w:b/>
-                <w:color w:val="24292F"/>
-              </w:rPr>
+          <w:tcPr/>
+          <w:p>
+            <w:pPr>
+              <w:pStyle w:val="Compact"/>
+              <w:jc w:val="left"/>
+            </w:pPr>
+            <w:r>
               <w:t xml:space="preserve">Waterfall (Каскадная модель)</w:t>
             </w:r>
           </w:p>
         </w:tc>
         <w:tc>
-          <w:tcPr>
-            <w:shd w:val="clear" w:color="auto" w:fill="F2F4F8"/>
-          </w:tcPr>
-          <w:p>
-            <w:pPr>
-              <w:pStyle w:val="Compact"/>
-              <w:jc w:val="left"/>
-            </w:pPr>
-            <w:r>
-              <w:rPr>
-                <w:b/>
-                <w:color w:val="24292F"/>
-              </w:rPr>
+          <w:tcPr/>
+          <w:p>
+            <w:pPr>
+              <w:pStyle w:val="Compact"/>
+              <w:jc w:val="left"/>
+            </w:pPr>
+            <w:r>
               <w:t xml:space="preserve">Scrum (Спринты и церемонии)</w:t>
             </w:r>
           </w:p>
         </w:tc>
         <w:tc>
-          <w:tcPr>
-            <w:shd w:val="clear" w:color="auto" w:fill="F2F4F8"/>
-          </w:tcPr>
-          <w:p>
-            <w:pPr>
-              <w:pStyle w:val="Compact"/>
-              <w:jc w:val="left"/>
-            </w:pPr>
-            <w:r>
-              <w:rPr>
-                <w:b/>
-                <w:color w:val="24292F"/>
-              </w:rPr>
+          <w:tcPr/>
+          <w:p>
+            <w:pPr>
+              <w:pStyle w:val="Compact"/>
+              <w:jc w:val="left"/>
+            </w:pPr>
+            <w:r>
               <w:t xml:space="preserve">Kanban (Управление потоком)</w:t>
             </w:r>
           </w:p>
         </w:tc>
       </w:tr>
       <w:tr>
-        <w:trPr>
-          <w:cantSplit/>
-        </w:trPr>
         <w:tc>
           <w:tcPr/>
           <w:p>
@@ -291,9 +175,6 @@
         </w:tc>
       </w:tr>
       <w:tr>
-        <w:trPr>
-          <w:cantSplit/>
-        </w:trPr>
         <w:tc>
           <w:tcPr/>
           <w:p>
@@ -358,9 +239,6 @@
         </w:tc>
       </w:tr>
       <w:tr>
-        <w:trPr>
-          <w:cantSplit/>
-        </w:trPr>
         <w:tc>
           <w:tcPr/>
           <w:p>
@@ -425,9 +303,6 @@
         </w:tc>
       </w:tr>
       <w:tr>
-        <w:trPr>
-          <w:cantSplit/>
-        </w:trPr>
         <w:tc>
           <w:tcPr/>
           <w:p>
@@ -492,9 +367,6 @@
         </w:tc>
       </w:tr>
       <w:tr>
-        <w:trPr>
-          <w:cantSplit/>
-        </w:trPr>
         <w:tc>
           <w:tcPr/>
           <w:p>
@@ -1842,20 +1714,6 @@
         <w:tblW w:type="pct" w:w="5000"/>
         <w:tblLayout w:type="fixed"/>
         <w:tblLook w:firstRow="1" w:lastRow="0" w:firstColumn="0" w:lastColumn="0" w:noHBand="0" w:noVBand="0" w:val="0020"/>
-        <w:tblBorders>
-          <w:top w:val="single" w:sz="4" w:space="0" w:color="D0D7DE"/>
-          <w:left w:val="single" w:sz="4" w:space="0" w:color="D0D7DE"/>
-          <w:bottom w:val="single" w:sz="4" w:space="0" w:color="D0D7DE"/>
-          <w:right w:val="single" w:sz="4" w:space="0" w:color="D0D7DE"/>
-          <w:insideH w:val="single" w:sz="4" w:space="0" w:color="D0D7DE"/>
-          <w:insideV w:val="single" w:sz="4" w:space="0" w:color="D0D7DE"/>
-        </w:tblBorders>
-        <w:tblCellMar>
-          <w:top w:w="120" w:type="dxa"/>
-          <w:bottom w:w="120" w:type="dxa"/>
-          <w:left w:w="160" w:type="dxa"/>
-          <w:right w:w="160" w:type="dxa"/>
-        </w:tblCellMar>
       </w:tblPr>
       <w:tblGrid>
         <w:gridCol w:w="1100"/>
@@ -1870,157 +1728,105 @@
       <w:tr>
         <w:trPr>
           <w:tblHeader w:val="on"/>
-          <w:cantSplit/>
         </w:trPr>
         <w:tc>
-          <w:tcPr>
-            <w:shd w:val="clear" w:color="auto" w:fill="F2F4F8"/>
-          </w:tcPr>
+          <w:tcPr/>
           <w:p>
             <w:pPr>
               <w:pStyle w:val="Compact"/>
               <w:jc w:val="center"/>
             </w:pPr>
             <w:r>
-              <w:rPr>
-                <w:b/>
-                <w:color w:val="24292F"/>
-              </w:rPr>
               <w:t xml:space="preserve">Ключ</w:t>
             </w:r>
           </w:p>
         </w:tc>
         <w:tc>
-          <w:tcPr>
-            <w:shd w:val="clear" w:color="auto" w:fill="F2F4F8"/>
-          </w:tcPr>
-          <w:p>
-            <w:pPr>
-              <w:pStyle w:val="Compact"/>
-              <w:jc w:val="left"/>
-            </w:pPr>
-            <w:r>
-              <w:rPr>
-                <w:b/>
-                <w:color w:val="24292F"/>
-              </w:rPr>
+          <w:tcPr/>
+          <w:p>
+            <w:pPr>
+              <w:pStyle w:val="Compact"/>
+              <w:jc w:val="left"/>
+            </w:pPr>
+            <w:r>
               <w:t xml:space="preserve">Название задачи (Task)</w:t>
             </w:r>
           </w:p>
         </w:tc>
         <w:tc>
-          <w:tcPr>
-            <w:shd w:val="clear" w:color="auto" w:fill="F2F4F8"/>
-          </w:tcPr>
-          <w:p>
-            <w:pPr>
-              <w:pStyle w:val="Compact"/>
-              <w:jc w:val="left"/>
-            </w:pPr>
-            <w:r>
-              <w:rPr>
-                <w:b/>
-                <w:color w:val="24292F"/>
-              </w:rPr>
+          <w:tcPr/>
+          <w:p>
+            <w:pPr>
+              <w:pStyle w:val="Compact"/>
+              <w:jc w:val="left"/>
+            </w:pPr>
+            <w:r>
               <w:t xml:space="preserve">Родительская сущность</w:t>
             </w:r>
           </w:p>
         </w:tc>
         <w:tc>
-          <w:tcPr>
-            <w:shd w:val="clear" w:color="auto" w:fill="F2F4F8"/>
-          </w:tcPr>
-          <w:p>
-            <w:pPr>
-              <w:pStyle w:val="Compact"/>
-              <w:jc w:val="left"/>
-            </w:pPr>
-            <w:r>
-              <w:rPr>
-                <w:b/>
-                <w:color w:val="24292F"/>
-              </w:rPr>
+          <w:tcPr/>
+          <w:p>
+            <w:pPr>
+              <w:pStyle w:val="Compact"/>
+              <w:jc w:val="left"/>
+            </w:pPr>
+            <w:r>
               <w:t xml:space="preserve">Исполнитель</w:t>
             </w:r>
           </w:p>
         </w:tc>
         <w:tc>
-          <w:tcPr>
-            <w:shd w:val="clear" w:color="auto" w:fill="F2F4F8"/>
-          </w:tcPr>
+          <w:tcPr/>
           <w:p>
             <w:pPr>
               <w:pStyle w:val="Compact"/>
               <w:jc w:val="center"/>
             </w:pPr>
             <w:r>
-              <w:rPr>
-                <w:b/>
-                <w:color w:val="24292F"/>
-              </w:rPr>
               <w:t xml:space="preserve">Спринт</w:t>
             </w:r>
           </w:p>
         </w:tc>
         <w:tc>
-          <w:tcPr>
-            <w:shd w:val="clear" w:color="auto" w:fill="F2F4F8"/>
-          </w:tcPr>
+          <w:tcPr/>
           <w:p>
             <w:pPr>
               <w:pStyle w:val="Compact"/>
               <w:jc w:val="center"/>
             </w:pPr>
             <w:r>
-              <w:rPr>
-                <w:b/>
-                <w:color w:val="24292F"/>
-              </w:rPr>
               <w:t xml:space="preserve">Приоритет</w:t>
             </w:r>
           </w:p>
         </w:tc>
         <w:tc>
-          <w:tcPr>
-            <w:shd w:val="clear" w:color="auto" w:fill="F2F4F8"/>
-          </w:tcPr>
+          <w:tcPr/>
           <w:p>
             <w:pPr>
               <w:pStyle w:val="Compact"/>
               <w:jc w:val="center"/>
             </w:pPr>
             <w:r>
-              <w:rPr>
-                <w:b/>
-                <w:color w:val="24292F"/>
-              </w:rPr>
               <w:t xml:space="preserve">Статус</w:t>
             </w:r>
           </w:p>
         </w:tc>
         <w:tc>
-          <w:tcPr>
-            <w:shd w:val="clear" w:color="auto" w:fill="F2F4F8"/>
-          </w:tcPr>
-          <w:p>
-            <w:pPr>
-              <w:pStyle w:val="Compact"/>
-              <w:jc w:val="left"/>
-            </w:pPr>
-            <w:r>
-              <w:rPr>
-                <w:b/>
-                <w:color w:val="24292F"/>
-              </w:rPr>
+          <w:tcPr/>
+          <w:p>
+            <w:pPr>
+              <w:pStyle w:val="Compact"/>
+              <w:jc w:val="left"/>
+            </w:pPr>
+            <w:r>
               <w:t xml:space="preserve">Ожидаемый результат (Deliverable)</w:t>
             </w:r>
           </w:p>
         </w:tc>
       </w:tr>
       <w:tr>
-        <w:trPr>
-          <w:cantSplit/>
-        </w:trPr>
         <w:tc>
           <w:tcPr/>
           <w:p>
@@ -2155,9 +1961,6 @@
         </w:tc>
       </w:tr>
       <w:tr>
-        <w:trPr>
-          <w:cantSplit/>
-        </w:trPr>
         <w:tc>
           <w:tcPr/>
           <w:p>
@@ -2292,9 +2095,6 @@
         </w:tc>
       </w:tr>
       <w:tr>
-        <w:trPr>
-          <w:cantSplit/>
-        </w:trPr>
         <w:tc>
           <w:tcPr/>
           <w:p>
@@ -2426,9 +2226,6 @@
         </w:tc>
       </w:tr>
       <w:tr>
-        <w:trPr>
-          <w:cantSplit/>
-        </w:trPr>
         <w:tc>
           <w:tcPr/>
           <w:p>
@@ -2580,20 +2377,6 @@
         <w:tblW w:type="pct" w:w="5000"/>
         <w:tblLayout w:type="fixed"/>
         <w:tblLook w:firstRow="1" w:lastRow="0" w:firstColumn="0" w:lastColumn="0" w:noHBand="0" w:noVBand="0" w:val="0020"/>
-        <w:tblBorders>
-          <w:top w:val="single" w:sz="4" w:space="0" w:color="D0D7DE"/>
-          <w:left w:val="single" w:sz="4" w:space="0" w:color="D0D7DE"/>
-          <w:bottom w:val="single" w:sz="4" w:space="0" w:color="D0D7DE"/>
-          <w:right w:val="single" w:sz="4" w:space="0" w:color="D0D7DE"/>
-          <w:insideH w:val="single" w:sz="4" w:space="0" w:color="D0D7DE"/>
-          <w:insideV w:val="single" w:sz="4" w:space="0" w:color="D0D7DE"/>
-        </w:tblBorders>
-        <w:tblCellMar>
-          <w:top w:w="120" w:type="dxa"/>
-          <w:bottom w:w="120" w:type="dxa"/>
-          <w:left w:w="160" w:type="dxa"/>
-          <w:right w:w="160" w:type="dxa"/>
-        </w:tblCellMar>
       </w:tblPr>
       <w:tblGrid>
         <w:gridCol w:w="2640"/>
@@ -2603,67 +2386,45 @@
       <w:tr>
         <w:trPr>
           <w:tblHeader w:val="on"/>
-          <w:cantSplit/>
         </w:trPr>
         <w:tc>
-          <w:tcPr>
-            <w:shd w:val="clear" w:color="auto" w:fill="F2F4F8"/>
-          </w:tcPr>
-          <w:p>
-            <w:pPr>
-              <w:pStyle w:val="Compact"/>
-              <w:jc w:val="left"/>
-            </w:pPr>
-            <w:r>
-              <w:rPr>
-                <w:b/>
-                <w:color w:val="24292F"/>
-              </w:rPr>
+          <w:tcPr/>
+          <w:p>
+            <w:pPr>
+              <w:pStyle w:val="Compact"/>
+              <w:jc w:val="left"/>
+            </w:pPr>
+            <w:r>
               <w:t xml:space="preserve">Статус</w:t>
             </w:r>
           </w:p>
         </w:tc>
         <w:tc>
-          <w:tcPr>
-            <w:shd w:val="clear" w:color="auto" w:fill="F2F4F8"/>
-          </w:tcPr>
-          <w:p>
-            <w:pPr>
-              <w:pStyle w:val="Compact"/>
-              <w:jc w:val="left"/>
-            </w:pPr>
-            <w:r>
-              <w:rPr>
-                <w:b/>
-                <w:color w:val="24292F"/>
-              </w:rPr>
+          <w:tcPr/>
+          <w:p>
+            <w:pPr>
+              <w:pStyle w:val="Compact"/>
+              <w:jc w:val="left"/>
+            </w:pPr>
+            <w:r>
               <w:t xml:space="preserve">Значение статуса</w:t>
             </w:r>
           </w:p>
         </w:tc>
         <w:tc>
-          <w:tcPr>
-            <w:shd w:val="clear" w:color="auto" w:fill="F2F4F8"/>
-          </w:tcPr>
-          <w:p>
-            <w:pPr>
-              <w:pStyle w:val="Compact"/>
-              <w:jc w:val="left"/>
-            </w:pPr>
-            <w:r>
-              <w:rPr>
-                <w:b/>
-                <w:color w:val="24292F"/>
-              </w:rPr>
+          <w:tcPr/>
+          <w:p>
+            <w:pPr>
+              <w:pStyle w:val="Compact"/>
+              <w:jc w:val="left"/>
+            </w:pPr>
+            <w:r>
               <w:t xml:space="preserve">Кто переводит в статус</w:t>
             </w:r>
           </w:p>
         </w:tc>
       </w:tr>
       <w:tr>
-        <w:trPr>
-          <w:cantSplit/>
-        </w:trPr>
         <w:tc>
           <w:tcPr/>
           <w:p>
@@ -2706,9 +2467,6 @@
         </w:tc>
       </w:tr>
       <w:tr>
-        <w:trPr>
-          <w:cantSplit/>
-        </w:trPr>
         <w:tc>
           <w:tcPr/>
           <w:p>
@@ -2751,9 +2509,6 @@
         </w:tc>
       </w:tr>
       <w:tr>
-        <w:trPr>
-          <w:cantSplit/>
-        </w:trPr>
         <w:tc>
           <w:tcPr/>
           <w:p>
@@ -2796,9 +2551,6 @@
         </w:tc>
       </w:tr>
       <w:tr>
-        <w:trPr>
-          <w:cantSplit/>
-        </w:trPr>
         <w:tc>
           <w:tcPr/>
           <w:p>
@@ -2841,9 +2593,6 @@
         </w:tc>
       </w:tr>
       <w:tr>
-        <w:trPr>
-          <w:cantSplit/>
-        </w:trPr>
         <w:tc>
           <w:tcPr/>
           <w:p>
@@ -2886,9 +2635,6 @@
         </w:tc>
       </w:tr>
       <w:tr>
-        <w:trPr>
-          <w:cantSplit/>
-        </w:trPr>
         <w:tc>
           <w:tcPr/>
           <w:p>
@@ -4620,670 +4366,896 @@
 </file>
 
 <file path=word/styles.xml><?xml version="1.0" encoding="utf-8"?>
-<ns0:styles xmlns:ns0="http://schemas.openxmlformats.org/wordprocessingml/2006/main">
-  <ns0:docDefaults>
-    <ns0:rPrDefault>
-      <ns0:rPr>
-        <ns0:rFonts ns0:asciiTheme="minorHAnsi" ns0:cstheme="minorBidi" ns0:eastAsiaTheme="minorEastAsia" ns0:hAnsiTheme="minorHAnsi"/>
-        <ns0:sz ns0:val="24"/>
-        <ns0:szCs ns0:val="24"/>
-        <ns0:lang ns0:bidi="ar-SA" ns0:eastAsia="zh-CN" ns0:val="en-US"/>
-      </ns0:rPr>
-    </ns0:rPrDefault>
-    <ns0:pPrDefault>
-      <ns0:pPr>
-        <ns0:spacing ns0:after="200"/>
-      </ns0:pPr>
-    </ns0:pPrDefault>
-  </ns0:docDefaults>
-  <ns0:latentStyles ns0:count="276" ns0:defLockedState="0" ns0:defQFormat="0" ns0:defSemiHidden="0" ns0:defUIPriority="0" ns0:defUnhideWhenUsed="0"/>
-  <ns0:style ns0:default="1" ns0:styleId="Normal" ns0:type="paragraph">
-    <ns0:name ns0:val="Normal"/>
-    <ns0:qFormat/>
-  </ns0:style>
-  <ns0:style ns0:styleId="BodyText" ns0:type="paragraph">
-    <ns0:name ns0:val="Body Text"/>
-    <ns0:basedOn ns0:val="Normal"/>
-    <ns0:link ns0:val="BodyTextChar"/>
-    <ns0:qFormat/>
-    <ns0:pPr>
-      <ns0:spacing ns0:after="180" ns0:before="180"/>
-    </ns0:pPr>
-  </ns0:style>
-  <ns0:style ns0:styleId="FirstParagraph" ns0:type="paragraph">
-    <ns0:name ns0:val="First Paragraph"/>
-    <ns0:basedOn ns0:val="BodyText"/>
-    <ns0:next ns0:val="BodyText"/>
-    <ns0:qFormat/>
-  </ns0:style>
-  <ns0:style ns0:styleId="Compact" ns0:type="paragraph">
-    <ns0:name ns0:val="Compact"/>
-    <ns0:basedOn ns0:val="BodyText"/>
-    <ns0:qFormat/>
-    <ns0:pPr>
-      <ns0:spacing ns0:after="36" ns0:before="36"/>
-    </ns0:pPr>
-  </ns0:style>
-  <ns0:style ns0:styleId="Title" ns0:type="paragraph">
-    <ns0:name ns0:val="Title"/>
-    <ns0:basedOn ns0:val="Normal"/>
-    <ns0:next ns0:val="BodyText"/>
-    <ns0:link ns0:val="TitleChar"/>
-    <ns0:uiPriority ns0:val="10"/>
-    <ns0:qFormat/>
-    <ns0:rsid ns0:val="00A10FD9"/>
-    <ns0:pPr>
-      <ns0:spacing ns0:after="80" ns0:line="240" ns0:lineRule="auto"/>
-      <ns0:contextualSpacing/>
-      <ns0:jc ns0:val="center"/>
-    </ns0:pPr>
-    <ns0:rPr>
-      <ns0:rFonts ns0:asciiTheme="majorHAnsi" ns0:cstheme="majorBidi" ns0:eastAsiaTheme="majorEastAsia" ns0:hAnsiTheme="majorHAnsi"/>
-      <ns0:sz ns0:val="56"/>
-      <ns0:szCs ns0:val="56"/>
-    </ns0:rPr>
-  </ns0:style>
-  <ns0:style ns0:styleId="TitleChar" ns0:type="character">
-    <ns0:name ns0:val="Title Char"/>
-    <ns0:basedOn ns0:val="DefaultParagraphFont"/>
-    <ns0:link ns0:val="Title"/>
-    <ns0:uiPriority ns0:val="10"/>
-    <ns0:rsid ns0:val="00A10FD9"/>
-    <ns0:rPr>
-      <ns0:rFonts ns0:asciiTheme="majorHAnsi" ns0:cstheme="majorBidi" ns0:eastAsiaTheme="majorEastAsia" ns0:hAnsiTheme="majorHAnsi"/>
-      <ns0:sz ns0:val="56"/>
-      <ns0:szCs ns0:val="56"/>
-    </ns0:rPr>
-  </ns0:style>
-  <ns0:style ns0:styleId="Subtitle" ns0:type="paragraph">
-    <ns0:name ns0:val="Subtitle"/>
-    <ns0:basedOn ns0:val="Title"/>
-    <ns0:next ns0:val="BodyText"/>
-    <ns0:link ns0:val="SubtitleChar"/>
-    <ns0:uiPriority ns0:val="11"/>
-    <ns0:qFormat/>
-    <ns0:rsid ns0:val="00A10FD9"/>
-    <ns0:pPr>
-      <ns0:numPr>
-        <ns0:ilvl ns0:val="1"/>
-      </ns0:numPr>
-    </ns0:pPr>
-    <ns0:rPr>
-      <ns0:rFonts ns0:cstheme="majorBidi" ns0:eastAsiaTheme="majorEastAsia"/>
-      <ns0:spacing ns0:val="15"/>
-      <ns0:sz ns0:val="28"/>
-      <ns0:szCs ns0:val="28"/>
-    </ns0:rPr>
-  </ns0:style>
-  <ns0:style ns0:styleId="SubtitleChar" ns0:type="character">
-    <ns0:name ns0:val="Subtitle Char"/>
-    <ns0:basedOn ns0:val="DefaultParagraphFont"/>
-    <ns0:link ns0:val="Subtitle"/>
-    <ns0:uiPriority ns0:val="11"/>
-    <ns0:rsid ns0:val="00A10FD9"/>
-    <ns0:rPr>
-      <ns0:rFonts ns0:cstheme="majorBidi" ns0:eastAsiaTheme="majorEastAsia"/>
-      <ns0:color ns0:themeColor="text1" ns0:themeTint="A6" ns0:val="595959"/>
-      <ns0:spacing ns0:val="15"/>
-      <ns0:sz ns0:val="28"/>
-      <ns0:szCs ns0:val="28"/>
-    </ns0:rPr>
-  </ns0:style>
-  <ns0:style ns0:styleId="Author" ns0:type="paragraph">
-    <ns0:name ns0:val="Author"/>
-    <ns0:basedOn ns0:val="Title"/>
-    <ns0:next ns0:val="BodyText"/>
-    <ns0:qFormat/>
-    <ns0:pPr>
-      <ns0:keepNext/>
-      <ns0:keepLines/>
-    </ns0:pPr>
-    <ns0:rPr>
-      <ns0:sz ns0:val="24"/>
-      <ns0:szCs ns0:val="24"/>
-    </ns0:rPr>
-  </ns0:style>
-  <ns0:style ns0:styleId="Date" ns0:type="paragraph">
-    <ns0:name ns0:val="Date"/>
-    <ns0:basedOn ns0:val="Title"/>
-    <ns0:next ns0:val="BodyText"/>
-    <ns0:qFormat/>
-    <ns0:pPr>
-      <ns0:keepNext/>
-      <ns0:keepLines/>
-    </ns0:pPr>
-    <ns0:rPr>
-      <ns0:sz ns0:val="24"/>
-      <ns0:szCs ns0:val="24"/>
-    </ns0:rPr>
-  </ns0:style>
-  <ns0:style ns0:styleId="AbstractTitle" ns0:type="paragraph">
-    <ns0:name ns0:val="Abstract Title"/>
-    <ns0:basedOn ns0:val="Normal"/>
-    <ns0:next ns0:val="Abstract"/>
-    <ns0:qFormat/>
-    <ns0:pPr>
-      <ns0:keepNext/>
-      <ns0:keepLines/>
-      <ns0:spacing ns0:after="0" ns0:before="300"/>
-      <ns0:jc ns0:val="center"/>
-    </ns0:pPr>
-    <ns0:rPr>
-      <ns0:b/>
-      <ns0:sz ns0:val="20"/>
-      <ns0:szCs ns0:val="20"/>
-    </ns0:rPr>
-  </ns0:style>
-  <ns0:style ns0:styleId="Abstract" ns0:type="paragraph">
-    <ns0:name ns0:val="Abstract"/>
-    <ns0:basedOn ns0:val="Normal"/>
-    <ns0:next ns0:val="BodyText"/>
-    <ns0:qFormat/>
-    <ns0:pPr>
-      <ns0:keepNext/>
-      <ns0:keepLines/>
-      <ns0:spacing ns0:after="300" ns0:before="100"/>
-    </ns0:pPr>
-    <ns0:rPr>
-      <ns0:sz ns0:val="20"/>
-      <ns0:szCs ns0:val="20"/>
-    </ns0:rPr>
-  </ns0:style>
-  <ns0:style ns0:styleId="Bibliography" ns0:type="paragraph">
-    <ns0:name ns0:val="Bibliography"/>
-    <ns0:basedOn ns0:val="Normal"/>
-    <ns0:next ns0:val="Bibliography"/>
-    <ns0:qFormat/>
-    <ns0:pPr/>
-    <ns0:rPr/>
-  </ns0:style>
-  <ns0:style ns0:styleId="Heading1" ns0:type="paragraph">
-    <ns0:name ns0:val="heading 1"/>
-    <ns0:basedOn ns0:val="Normal"/>
-    <ns0:next ns0:val="BodyText"/>
-    <ns0:link ns0:val="Heading1Char"/>
-    <ns0:uiPriority ns0:val="9"/>
-    <ns0:qFormat/>
-    <ns0:rsid ns0:val="00A10FD9"/>
-    <ns0:pPr>
-      <ns0:keepNext/>
-      <ns0:keepLines/>
-      <ns0:spacing ns0:after="80" ns0:before="360"/>
-      <ns0:outlineLvl ns0:val="0"/>
-    </ns0:pPr>
-    <ns0:rPr>
-      <ns0:rFonts ns0:asciiTheme="majorHAnsi" ns0:cstheme="majorBidi" ns0:eastAsiaTheme="majorEastAsia" ns0:hAnsiTheme="majorHAnsi"/>
-      <ns0:color ns0:themeColor="accent1" ns0:themeShade="BF" ns0:val="0F4761"/>
-      <ns0:sz ns0:val="40"/>
-      <ns0:szCs ns0:val="40"/>
-    </ns0:rPr>
-  </ns0:style>
-  <ns0:style ns0:styleId="Heading2" ns0:type="paragraph">
-    <ns0:name ns0:val="heading 2"/>
-    <ns0:basedOn ns0:val="Normal"/>
-    <ns0:next ns0:val="BodyText"/>
-    <ns0:link ns0:val="Heading2Char"/>
-    <ns0:uiPriority ns0:val="9"/>
-    <ns0:semiHidden/>
-    <ns0:unhideWhenUsed/>
-    <ns0:qFormat/>
-    <ns0:rsid ns0:val="00A10FD9"/>
-    <ns0:pPr>
-      <ns0:keepNext/>
-      <ns0:keepLines/>
-      <ns0:spacing ns0:after="80" ns0:before="160"/>
-      <ns0:outlineLvl ns0:val="1"/>
-    </ns0:pPr>
-    <ns0:rPr>
-      <ns0:rFonts ns0:asciiTheme="majorHAnsi" ns0:cstheme="majorBidi" ns0:eastAsiaTheme="majorEastAsia" ns0:hAnsiTheme="majorHAnsi"/>
-      <ns0:color ns0:themeColor="accent1" ns0:themeShade="BF" ns0:val="0F4761"/>
-      <ns0:sz ns0:val="32"/>
-      <ns0:szCs ns0:val="32"/>
-    </ns0:rPr>
-  </ns0:style>
-  <ns0:style ns0:styleId="Heading3" ns0:type="paragraph">
-    <ns0:name ns0:val="heading 3"/>
-    <ns0:basedOn ns0:val="Normal"/>
-    <ns0:next ns0:val="BodyText"/>
-    <ns0:link ns0:val="Heading3Char"/>
-    <ns0:uiPriority ns0:val="9"/>
-    <ns0:semiHidden/>
-    <ns0:unhideWhenUsed/>
-    <ns0:qFormat/>
-    <ns0:rsid ns0:val="00A10FD9"/>
-    <ns0:pPr>
-      <ns0:keepNext/>
-      <ns0:keepLines/>
-      <ns0:spacing ns0:after="80" ns0:before="160"/>
-      <ns0:outlineLvl ns0:val="2"/>
-    </ns0:pPr>
-    <ns0:rPr>
-      <ns0:rFonts ns0:cstheme="majorBidi" ns0:eastAsiaTheme="majorEastAsia"/>
-      <ns0:color ns0:themeColor="accent1" ns0:themeShade="BF" ns0:val="0F4761"/>
-      <ns0:sz ns0:val="28"/>
-      <ns0:szCs ns0:val="28"/>
-    </ns0:rPr>
-  </ns0:style>
-  <ns0:style ns0:styleId="Heading4" ns0:type="paragraph">
-    <ns0:name ns0:val="heading 4"/>
-    <ns0:basedOn ns0:val="Normal"/>
-    <ns0:next ns0:val="BodyText"/>
-    <ns0:link ns0:val="Heading4Char"/>
-    <ns0:uiPriority ns0:val="9"/>
-    <ns0:semiHidden/>
-    <ns0:unhideWhenUsed/>
-    <ns0:qFormat/>
-    <ns0:rsid ns0:val="00A10FD9"/>
-    <ns0:pPr>
-      <ns0:keepNext/>
-      <ns0:keepLines/>
-      <ns0:spacing ns0:after="40" ns0:before="80"/>
-      <ns0:outlineLvl ns0:val="3"/>
-    </ns0:pPr>
-    <ns0:rPr>
-      <ns0:rFonts ns0:cstheme="majorBidi" ns0:eastAsiaTheme="majorEastAsia"/>
-      <ns0:i/>
-      <ns0:iCs/>
-      <ns0:color ns0:themeColor="accent1" ns0:themeShade="BF" ns0:val="0F4761"/>
-    </ns0:rPr>
-  </ns0:style>
-  <ns0:style ns0:styleId="Heading5" ns0:type="paragraph">
-    <ns0:name ns0:val="heading 5"/>
-    <ns0:basedOn ns0:val="Normal"/>
-    <ns0:next ns0:val="BodyText"/>
-    <ns0:link ns0:val="Heading5Char"/>
-    <ns0:uiPriority ns0:val="9"/>
-    <ns0:semiHidden/>
-    <ns0:unhideWhenUsed/>
-    <ns0:qFormat/>
-    <ns0:rsid ns0:val="00A10FD9"/>
-    <ns0:pPr>
-      <ns0:keepNext/>
-      <ns0:keepLines/>
-      <ns0:spacing ns0:after="40" ns0:before="80"/>
-      <ns0:outlineLvl ns0:val="4"/>
-    </ns0:pPr>
-    <ns0:rPr>
-      <ns0:rFonts ns0:cstheme="majorBidi" ns0:eastAsiaTheme="majorEastAsia"/>
-      <ns0:color ns0:themeColor="accent1" ns0:themeShade="BF" ns0:val="0F4761"/>
-    </ns0:rPr>
-  </ns0:style>
-  <ns0:style ns0:styleId="Heading6" ns0:type="paragraph">
-    <ns0:name ns0:val="heading 6"/>
-    <ns0:basedOn ns0:val="Normal"/>
-    <ns0:next ns0:val="BodyText"/>
-    <ns0:link ns0:val="Heading6Char"/>
-    <ns0:uiPriority ns0:val="9"/>
-    <ns0:semiHidden/>
-    <ns0:unhideWhenUsed/>
-    <ns0:qFormat/>
-    <ns0:rsid ns0:val="00A10FD9"/>
-    <ns0:pPr>
-      <ns0:keepNext/>
-      <ns0:keepLines/>
-      <ns0:spacing ns0:after="0" ns0:before="40"/>
-      <ns0:outlineLvl ns0:val="5"/>
-    </ns0:pPr>
-    <ns0:rPr>
-      <ns0:rFonts ns0:cstheme="majorBidi" ns0:eastAsiaTheme="majorEastAsia"/>
-      <ns0:i/>
-      <ns0:iCs/>
-      <ns0:color ns0:themeColor="text1" ns0:themeTint="A6" ns0:val="595959"/>
-    </ns0:rPr>
-  </ns0:style>
-  <ns0:style ns0:styleId="Heading7" ns0:type="paragraph">
-    <ns0:name ns0:val="heading 7"/>
-    <ns0:basedOn ns0:val="Normal"/>
-    <ns0:next ns0:val="BodyText"/>
-    <ns0:link ns0:val="Heading7Char"/>
-    <ns0:uiPriority ns0:val="9"/>
-    <ns0:semiHidden/>
-    <ns0:unhideWhenUsed/>
-    <ns0:qFormat/>
-    <ns0:rsid ns0:val="00A10FD9"/>
-    <ns0:pPr>
-      <ns0:keepNext/>
-      <ns0:keepLines/>
-      <ns0:spacing ns0:after="0" ns0:before="40"/>
-      <ns0:outlineLvl ns0:val="6"/>
-    </ns0:pPr>
-    <ns0:rPr>
-      <ns0:rFonts ns0:cstheme="majorBidi" ns0:eastAsiaTheme="majorEastAsia"/>
-      <ns0:color ns0:themeColor="text1" ns0:themeTint="A6" ns0:val="595959"/>
-    </ns0:rPr>
-  </ns0:style>
-  <ns0:style ns0:styleId="Heading8" ns0:type="paragraph">
-    <ns0:name ns0:val="heading 8"/>
-    <ns0:basedOn ns0:val="Normal"/>
-    <ns0:next ns0:val="BodyText"/>
-    <ns0:link ns0:val="Heading8Char"/>
-    <ns0:uiPriority ns0:val="9"/>
-    <ns0:semiHidden/>
-    <ns0:unhideWhenUsed/>
-    <ns0:qFormat/>
-    <ns0:rsid ns0:val="00A10FD9"/>
-    <ns0:pPr>
-      <ns0:keepNext/>
-      <ns0:keepLines/>
-      <ns0:spacing ns0:after="0"/>
-      <ns0:outlineLvl ns0:val="7"/>
-    </ns0:pPr>
-    <ns0:rPr>
-      <ns0:rFonts ns0:cstheme="majorBidi" ns0:eastAsiaTheme="majorEastAsia"/>
-      <ns0:i/>
-      <ns0:iCs/>
-      <ns0:color ns0:themeColor="text1" ns0:themeTint="D8" ns0:val="272727"/>
-    </ns0:rPr>
-  </ns0:style>
-  <ns0:style ns0:styleId="Heading9" ns0:type="paragraph">
-    <ns0:name ns0:val="heading 9"/>
-    <ns0:basedOn ns0:val="Normal"/>
-    <ns0:next ns0:val="BodyText"/>
-    <ns0:link ns0:val="Heading9Char"/>
-    <ns0:uiPriority ns0:val="9"/>
-    <ns0:semiHidden/>
-    <ns0:unhideWhenUsed/>
-    <ns0:qFormat/>
-    <ns0:rsid ns0:val="00A10FD9"/>
-    <ns0:pPr>
-      <ns0:keepNext/>
-      <ns0:keepLines/>
-      <ns0:spacing ns0:after="0"/>
-      <ns0:outlineLvl ns0:val="8"/>
-    </ns0:pPr>
-    <ns0:rPr>
-      <ns0:rFonts ns0:cstheme="majorBidi" ns0:eastAsiaTheme="majorEastAsia"/>
-      <ns0:color ns0:themeColor="text1" ns0:themeTint="D8" ns0:val="272727"/>
-    </ns0:rPr>
-  </ns0:style>
-  <ns0:style ns0:styleId="Heading1Char" ns0:type="character">
-    <ns0:name ns0:val="Heading 1 Char"/>
-    <ns0:basedOn ns0:val="DefaultParagraphFont"/>
-    <ns0:link ns0:val="Heading1"/>
-    <ns0:uiPriority ns0:val="9"/>
-    <ns0:rsid ns0:val="00A10FD9"/>
-    <ns0:rPr>
-      <ns0:rFonts ns0:asciiTheme="majorHAnsi" ns0:cstheme="majorBidi" ns0:eastAsiaTheme="majorEastAsia" ns0:hAnsiTheme="majorHAnsi"/>
-      <ns0:color ns0:themeColor="accent1" ns0:themeShade="BF" ns0:val="0F4761"/>
-      <ns0:sz ns0:val="40"/>
-      <ns0:szCs ns0:val="40"/>
-    </ns0:rPr>
-  </ns0:style>
-  <ns0:style ns0:styleId="Heading2Char" ns0:type="character">
-    <ns0:name ns0:val="Heading 2 Char"/>
-    <ns0:basedOn ns0:val="DefaultParagraphFont"/>
-    <ns0:link ns0:val="Heading2"/>
-    <ns0:uiPriority ns0:val="9"/>
-    <ns0:semiHidden/>
-    <ns0:rsid ns0:val="00A10FD9"/>
-    <ns0:rPr>
-      <ns0:rFonts ns0:asciiTheme="majorHAnsi" ns0:cstheme="majorBidi" ns0:eastAsiaTheme="majorEastAsia" ns0:hAnsiTheme="majorHAnsi"/>
-      <ns0:color ns0:themeColor="accent1" ns0:themeShade="BF" ns0:val="0F4761"/>
-      <ns0:sz ns0:val="32"/>
-      <ns0:szCs ns0:val="32"/>
-    </ns0:rPr>
-  </ns0:style>
-  <ns0:style ns0:styleId="Heading3Char" ns0:type="character">
-    <ns0:name ns0:val="Heading 3 Char"/>
-    <ns0:basedOn ns0:val="DefaultParagraphFont"/>
-    <ns0:link ns0:val="Heading3"/>
-    <ns0:uiPriority ns0:val="9"/>
-    <ns0:semiHidden/>
-    <ns0:rsid ns0:val="00A10FD9"/>
-    <ns0:rPr>
-      <ns0:rFonts ns0:cstheme="majorBidi" ns0:eastAsiaTheme="majorEastAsia"/>
-      <ns0:color ns0:themeColor="accent1" ns0:themeShade="BF" ns0:val="0F4761"/>
-      <ns0:sz ns0:val="28"/>
-      <ns0:szCs ns0:val="28"/>
-    </ns0:rPr>
-  </ns0:style>
-  <ns0:style ns0:styleId="Heading4Char" ns0:type="character">
-    <ns0:name ns0:val="Heading 4 Char"/>
-    <ns0:basedOn ns0:val="DefaultParagraphFont"/>
-    <ns0:link ns0:val="Heading4"/>
-    <ns0:uiPriority ns0:val="9"/>
-    <ns0:semiHidden/>
-    <ns0:rsid ns0:val="00A10FD9"/>
-    <ns0:rPr>
-      <ns0:rFonts ns0:cstheme="majorBidi" ns0:eastAsiaTheme="majorEastAsia"/>
-      <ns0:i/>
-      <ns0:iCs/>
-      <ns0:color ns0:themeColor="accent1" ns0:themeShade="BF" ns0:val="0F4761"/>
-    </ns0:rPr>
-  </ns0:style>
-  <ns0:style ns0:styleId="Heading5Char" ns0:type="character">
-    <ns0:name ns0:val="Heading 5 Char"/>
-    <ns0:basedOn ns0:val="DefaultParagraphFont"/>
-    <ns0:link ns0:val="Heading5"/>
-    <ns0:uiPriority ns0:val="9"/>
-    <ns0:semiHidden/>
-    <ns0:rsid ns0:val="00A10FD9"/>
-    <ns0:rPr>
-      <ns0:rFonts ns0:cstheme="majorBidi" ns0:eastAsiaTheme="majorEastAsia"/>
-      <ns0:color ns0:themeColor="accent1" ns0:themeShade="BF" ns0:val="0F4761"/>
-    </ns0:rPr>
-  </ns0:style>
-  <ns0:style ns0:styleId="Heading6Char" ns0:type="character">
-    <ns0:name ns0:val="Heading 6 Char"/>
-    <ns0:basedOn ns0:val="DefaultParagraphFont"/>
-    <ns0:link ns0:val="Heading6"/>
-    <ns0:uiPriority ns0:val="9"/>
-    <ns0:semiHidden/>
-    <ns0:rsid ns0:val="00A10FD9"/>
-    <ns0:rPr>
-      <ns0:rFonts ns0:cstheme="majorBidi" ns0:eastAsiaTheme="majorEastAsia"/>
-      <ns0:i/>
-      <ns0:iCs/>
-      <ns0:color ns0:themeColor="text1" ns0:themeTint="A6" ns0:val="595959"/>
-    </ns0:rPr>
-  </ns0:style>
-  <ns0:style ns0:styleId="Heading7Char" ns0:type="character">
-    <ns0:name ns0:val="Heading 7 Char"/>
-    <ns0:basedOn ns0:val="DefaultParagraphFont"/>
-    <ns0:link ns0:val="Heading7"/>
-    <ns0:uiPriority ns0:val="9"/>
-    <ns0:semiHidden/>
-    <ns0:rsid ns0:val="00A10FD9"/>
-    <ns0:rPr>
-      <ns0:rFonts ns0:cstheme="majorBidi" ns0:eastAsiaTheme="majorEastAsia"/>
-      <ns0:color ns0:themeColor="text1" ns0:themeTint="A6" ns0:val="595959"/>
-    </ns0:rPr>
-  </ns0:style>
-  <ns0:style ns0:styleId="Heading8Char" ns0:type="character">
-    <ns0:name ns0:val="Heading 8 Char"/>
-    <ns0:basedOn ns0:val="DefaultParagraphFont"/>
-    <ns0:link ns0:val="Heading8"/>
-    <ns0:uiPriority ns0:val="9"/>
-    <ns0:semiHidden/>
-    <ns0:rsid ns0:val="00A10FD9"/>
-    <ns0:rPr>
-      <ns0:rFonts ns0:cstheme="majorBidi" ns0:eastAsiaTheme="majorEastAsia"/>
-      <ns0:i/>
-      <ns0:iCs/>
-      <ns0:color ns0:themeColor="text1" ns0:themeTint="D8" ns0:val="272727"/>
-    </ns0:rPr>
-  </ns0:style>
-  <ns0:style ns0:styleId="Heading9Char" ns0:type="character">
-    <ns0:name ns0:val="Heading 9 Char"/>
-    <ns0:basedOn ns0:val="DefaultParagraphFont"/>
-    <ns0:link ns0:val="Heading9"/>
-    <ns0:uiPriority ns0:val="9"/>
-    <ns0:semiHidden/>
-    <ns0:rsid ns0:val="00A10FD9"/>
-    <ns0:rPr>
-      <ns0:rFonts ns0:cstheme="majorBidi" ns0:eastAsiaTheme="majorEastAsia"/>
-      <ns0:color ns0:themeColor="text1" ns0:themeTint="D8" ns0:val="272727"/>
-    </ns0:rPr>
-  </ns0:style>
-  <ns0:style ns0:styleId="BlockText" ns0:type="paragraph">
-    <ns0:name ns0:val="Block Text"/>
-    <ns0:basedOn ns0:val="BodyText"/>
-    <ns0:next ns0:val="BodyText"/>
-    <ns0:uiPriority ns0:val="9"/>
-    <ns0:unhideWhenUsed/>
-    <ns0:qFormat/>
-    <ns0:pPr>
-      <ns0:spacing ns0:after="100" ns0:before="100"/>
-      <ns0:ind ns0:firstLine="0" ns0:left="480" ns0:right="480"/>
-    </ns0:pPr>
-  </ns0:style>
-  <ns0:style ns0:styleId="FootnoteText" ns0:type="paragraph">
-    <ns0:name ns0:val="Footnote Text"/>
-    <ns0:basedOn ns0:val="Normal"/>
-    <ns0:next ns0:val="FootnoteText"/>
-    <ns0:uiPriority ns0:val="9"/>
-    <ns0:unhideWhenUsed/>
-    <ns0:qFormat/>
-  </ns0:style>
-  <ns0:style ns0:styleId="FootnoteBlockText" ns0:type="paragraph">
-    <ns0:name ns0:val="Footnote Block Text"/>
-    <ns0:basedOn ns0:val="FootnoteText"/>
-    <ns0:next ns0:val="FootnoteText"/>
-    <ns0:uiPriority ns0:val="9"/>
-    <ns0:unhideWhenUsed/>
-    <ns0:qFormat/>
-    <ns0:pPr>
-      <ns0:spacing ns0:after="100" ns0:before="100"/>
-      <ns0:ind ns0:firstLine="0" ns0:left="480" ns0:right="480"/>
-    </ns0:pPr>
-  </ns0:style>
-  <ns0:style ns0:default="1" ns0:styleId="DefaultParagraphFont" ns0:type="character">
-    <ns0:name ns0:val="Default Paragraph Font"/>
-    <ns0:semiHidden/>
-    <ns0:unhideWhenUsed/>
-  </ns0:style>
-  <ns0:style ns0:default="1" ns0:styleId="Table" ns0:type="table">
-    <ns0:name ns0:val="Table"/>
-    <ns0:basedOn ns0:val="TableNormal"/>
-    <ns0:semiHidden/>
-    <ns0:unhideWhenUsed/>
-    <ns0:qFormat/>
-    <ns0:tblPr>
-      <ns0:tblInd ns0:type="dxa" ns0:w="0"/>
-      <ns0:tblCellMar>
-        <ns0:top ns0:type="dxa" ns0:w="0"/>
-        <ns0:left ns0:type="dxa" ns0:w="108"/>
-        <ns0:bottom ns0:type="dxa" ns0:w="0"/>
-        <ns0:right ns0:type="dxa" ns0:w="108"/>
-      </ns0:tblCellMar>
-    </ns0:tblPr>
-    <ns0:tblStylePr ns0:type="firstRow">
-      <ns0:tcPr>
-        <ns0:tcBorders>
-          <ns0:bottom ns0:val="single"/>
-        </ns0:tcBorders>
-        <ns0:vAlign ns0:val="bottom"/>
-      </ns0:tcPr>
-    </ns0:tblStylePr>
-  </ns0:style>
-  <ns0:style ns0:styleId="DefinitionTerm" ns0:type="paragraph">
-    <ns0:name ns0:val="Definition Term"/>
-    <ns0:basedOn ns0:val="Normal"/>
-    <ns0:next ns0:val="Definition"/>
-    <ns0:pPr>
-      <ns0:keepNext/>
-      <ns0:keepLines/>
-      <ns0:spacing ns0:after="0"/>
-    </ns0:pPr>
-    <ns0:rPr>
-      <ns0:b/>
-    </ns0:rPr>
-  </ns0:style>
-  <ns0:style ns0:styleId="Definition" ns0:type="paragraph">
-    <ns0:name ns0:val="Definition"/>
-    <ns0:basedOn ns0:val="Normal"/>
-  </ns0:style>
-  <ns0:style ns0:styleId="Caption" ns0:type="paragraph">
-    <ns0:name ns0:val="Caption"/>
-    <ns0:basedOn ns0:val="Normal"/>
-    <ns0:link ns0:val="BodyTextChar"/>
-    <ns0:pPr>
-      <ns0:spacing ns0:after="120" ns0:before="0"/>
-    </ns0:pPr>
-    <ns0:rPr>
-      <ns0:i/>
-    </ns0:rPr>
-  </ns0:style>
-  <ns0:style ns0:styleId="TableCaption" ns0:type="paragraph">
-    <ns0:name ns0:val="Table Caption"/>
-    <ns0:basedOn ns0:val="Caption"/>
-    <ns0:pPr>
-      <ns0:keepNext/>
-    </ns0:pPr>
-  </ns0:style>
-  <ns0:style ns0:styleId="ImageCaption" ns0:type="paragraph">
-    <ns0:name ns0:val="Image Caption"/>
-    <ns0:basedOn ns0:val="Caption"/>
-  </ns0:style>
-  <ns0:style ns0:styleId="Figure" ns0:type="paragraph">
-    <ns0:name ns0:val="Figure"/>
-    <ns0:basedOn ns0:val="Normal"/>
-  </ns0:style>
-  <ns0:style ns0:styleId="CaptionedFigure" ns0:type="paragraph">
-    <ns0:name ns0:val="Captioned Figure"/>
-    <ns0:basedOn ns0:val="Figure"/>
-    <ns0:pPr>
-      <ns0:keepNext/>
-    </ns0:pPr>
-  </ns0:style>
-  <ns0:style ns0:styleId="BodyTextChar" ns0:type="character">
-    <ns0:name ns0:val="Body Text Char"/>
-    <ns0:basedOn ns0:val="DefaultParagraphFont"/>
-    <ns0:link ns0:val="BodyText"/>
-  </ns0:style>
-  <ns0:style ns0:styleId="VerbatimChar" ns0:type="character">
-    <ns0:name ns0:val="Verbatim Char"/>
-    <ns0:basedOn ns0:val="BodyTextChar"/>
-    <ns0:rPr>
-      <ns0:rFonts ns0:ascii="Consolas" ns0:hAnsi="Consolas"/>
-      <ns0:sz ns0:val="22"/>
-    </ns0:rPr>
-  </ns0:style>
-  <ns0:style ns0:styleId="SectionNumber" ns0:type="character">
-    <ns0:name ns0:val="Section Number"/>
-    <ns0:basedOn ns0:val="BodyTextChar"/>
-  </ns0:style>
-  <ns0:style ns0:styleId="FootnoteReference" ns0:type="character">
-    <ns0:name ns0:val="Footnote Reference"/>
-    <ns0:basedOn ns0:val="BodyTextChar"/>
-    <ns0:rPr>
-      <ns0:vertAlign ns0:val="superscript"/>
-    </ns0:rPr>
-  </ns0:style>
-  <ns0:style ns0:styleId="Hyperlink" ns0:type="character">
-    <ns0:name ns0:val="Hyperlink"/>
-    <ns0:basedOn ns0:val="BodyTextChar"/>
-    <ns0:rPr>
-      <ns0:color ns0:themeColor="accent1" ns0:val="4F81BD"/>
-    </ns0:rPr>
-  </ns0:style>
-  <ns0:style ns0:styleId="TOCHeading" ns0:type="paragraph">
-    <ns0:name ns0:val="TOC Heading"/>
-    <ns0:basedOn ns0:val="Heading1"/>
-    <ns0:next ns0:val="BodyText"/>
-    <ns0:uiPriority ns0:val="39"/>
-    <ns0:unhideWhenUsed/>
-    <ns0:qFormat/>
-    <ns0:pPr>
-      <ns0:spacing ns0:before="240" ns0:line="259" ns0:lineRule="auto"/>
-      <ns0:outlineLvl ns0:val="9"/>
-    </ns0:pPr>
-    <ns0:rPr>
-      <ns0:rFonts ns0:asciiTheme="majorHAnsi" ns0:cstheme="majorBidi" ns0:eastAsiaTheme="majorEastAsia" ns0:hAnsiTheme="majorHAnsi"/>
-      <ns0:b ns0:val="0"/>
-      <ns0:bCs ns0:val="0"/>
-      <ns0:color ns0:themeColor="accent1" ns0:themeShade="BF" ns0:val="365F91"/>
-    </ns0:rPr>
-  </ns0:style>
-  <ns0:style ns0:type="paragraph" ns0:styleId="SourceCode">
-    <ns0:name ns0:val="Source Code"/>
-    <ns0:basedOn ns0:val="Normal"/>
-    <ns0:link ns0:val="VerbatimChar"/>
-    <ns0:pPr>
-      <ns0:wordWrap ns0:val="off"/>
-    </ns0:pPr>
-  </ns0:style>
-</ns0:styles>
+<w:styles xmlns:r="http://schemas.openxmlformats.org/officeDocument/2006/relationships" xmlns:w="http://schemas.openxmlformats.org/wordprocessingml/2006/main">
+  <w:docDefaults>
+    <w:rPrDefault>
+      <w:rPr>
+        <w:rFonts w:asciiTheme="minorHAnsi" w:cstheme="minorBidi" w:eastAsiaTheme="minorEastAsia" w:hAnsiTheme="minorHAnsi"/>
+        <w:sz w:val="24"/>
+        <w:szCs w:val="24"/>
+        <w:lang w:bidi="ar-SA" w:eastAsia="zh-CN" w:val="en-US"/>
+      </w:rPr>
+    </w:rPrDefault>
+    <w:pPrDefault>
+      <w:pPr>
+        <w:spacing w:after="200"/>
+      </w:pPr>
+    </w:pPrDefault>
+  </w:docDefaults>
+  <w:latentStyles w:count="276" w:defLockedState="0" w:defQFormat="0" w:defSemiHidden="0" w:defUIPriority="0" w:defUnhideWhenUsed="0"/>
+  <w:style w:default="1" w:styleId="Normal" w:type="paragraph">
+    <w:name w:val="Normal"/>
+    <w:qFormat/>
+  </w:style>
+  <w:style w:styleId="BodyText" w:type="paragraph">
+    <w:name w:val="Body Text"/>
+    <w:basedOn w:val="Normal"/>
+    <w:link w:val="BodyTextChar"/>
+    <w:qFormat/>
+    <w:pPr>
+      <w:spacing w:after="180" w:before="180"/>
+    </w:pPr>
+  </w:style>
+  <w:style w:customStyle="1" w:styleId="FirstParagraph" w:type="paragraph">
+    <w:name w:val="First Paragraph"/>
+    <w:basedOn w:val="BodyText"/>
+    <w:next w:val="BodyText"/>
+    <w:qFormat/>
+  </w:style>
+  <w:style w:customStyle="1" w:styleId="Compact" w:type="paragraph">
+    <w:name w:val="Compact"/>
+    <w:basedOn w:val="BodyText"/>
+    <w:qFormat/>
+    <w:pPr>
+      <w:spacing w:after="36" w:before="36"/>
+    </w:pPr>
+  </w:style>
+  <w:style w:styleId="Title" w:type="paragraph">
+    <w:name w:val="Title"/>
+    <w:basedOn w:val="Normal"/>
+    <w:next w:val="BodyText"/>
+    <w:link w:val="TitleChar"/>
+    <w:uiPriority w:val="10"/>
+    <w:qFormat/>
+    <w:rsid w:val="00A10FD9"/>
+    <w:pPr>
+      <w:spacing w:after="80" w:line="240" w:lineRule="auto"/>
+      <w:contextualSpacing/>
+      <w:jc w:val="center"/>
+    </w:pPr>
+    <w:rPr>
+      <w:rFonts w:asciiTheme="majorHAnsi" w:cstheme="majorBidi" w:eastAsiaTheme="majorEastAsia" w:hAnsiTheme="majorHAnsi"/>
+      <w:sz w:val="56"/>
+      <w:szCs w:val="56"/>
+    </w:rPr>
+  </w:style>
+  <w:style w:customStyle="1" w:styleId="TitleChar" w:type="character">
+    <w:name w:val="Title Char"/>
+    <w:basedOn w:val="DefaultParagraphFont"/>
+    <w:link w:val="Title"/>
+    <w:uiPriority w:val="10"/>
+    <w:rsid w:val="00A10FD9"/>
+    <w:rPr>
+      <w:rFonts w:asciiTheme="majorHAnsi" w:cstheme="majorBidi" w:eastAsiaTheme="majorEastAsia" w:hAnsiTheme="majorHAnsi"/>
+      <w:sz w:val="56"/>
+      <w:szCs w:val="56"/>
+    </w:rPr>
+  </w:style>
+  <w:style w:styleId="Subtitle" w:type="paragraph">
+    <w:name w:val="Subtitle"/>
+    <w:basedOn w:val="Title"/>
+    <w:next w:val="BodyText"/>
+    <w:link w:val="SubtitleChar"/>
+    <w:uiPriority w:val="11"/>
+    <w:qFormat/>
+    <w:rsid w:val="00A10FD9"/>
+    <w:pPr>
+      <w:numPr>
+        <w:ilvl w:val="1"/>
+      </w:numPr>
+    </w:pPr>
+    <w:rPr>
+      <w:rFonts w:cstheme="majorBidi" w:eastAsiaTheme="majorEastAsia"/>
+      <w:spacing w:val="15"/>
+      <w:sz w:val="28"/>
+      <w:szCs w:val="28"/>
+    </w:rPr>
+  </w:style>
+  <w:style w:customStyle="1" w:styleId="SubtitleChar" w:type="character">
+    <w:name w:val="Subtitle Char"/>
+    <w:basedOn w:val="DefaultParagraphFont"/>
+    <w:link w:val="Subtitle"/>
+    <w:uiPriority w:val="11"/>
+    <w:rsid w:val="00A10FD9"/>
+    <w:rPr>
+      <w:rFonts w:cstheme="majorBidi" w:eastAsiaTheme="majorEastAsia"/>
+      <w:color w:themeColor="text1" w:themeTint="A6" w:val="595959"/>
+      <w:spacing w:val="15"/>
+      <w:sz w:val="28"/>
+      <w:szCs w:val="28"/>
+    </w:rPr>
+  </w:style>
+  <w:style w:customStyle="1" w:styleId="Author" w:type="paragraph">
+    <w:name w:val="Author"/>
+    <w:basedOn w:val="Title"/>
+    <w:next w:val="BodyText"/>
+    <w:qFormat/>
+    <w:pPr>
+      <w:keepNext/>
+      <w:keepLines/>
+    </w:pPr>
+    <w:rPr>
+      <w:sz w:val="24"/>
+      <w:szCs w:val="24"/>
+    </w:rPr>
+  </w:style>
+  <w:style w:styleId="Date" w:type="paragraph">
+    <w:name w:val="Date"/>
+    <w:basedOn w:val="Title"/>
+    <w:next w:val="BodyText"/>
+    <w:qFormat/>
+    <w:pPr>
+      <w:keepNext/>
+      <w:keepLines/>
+    </w:pPr>
+    <w:rPr>
+      <w:sz w:val="24"/>
+      <w:szCs w:val="24"/>
+    </w:rPr>
+  </w:style>
+  <w:style w:customStyle="1" w:styleId="AbstractTitle" w:type="paragraph">
+    <w:name w:val="Abstract Title"/>
+    <w:basedOn w:val="Normal"/>
+    <w:next w:val="Abstract"/>
+    <w:qFormat/>
+    <w:pPr>
+      <w:keepNext/>
+      <w:keepLines/>
+      <w:spacing w:after="0" w:before="300"/>
+      <w:jc w:val="center"/>
+    </w:pPr>
+    <w:rPr>
+      <w:b/>
+      <w:sz w:val="20"/>
+      <w:szCs w:val="20"/>
+    </w:rPr>
+  </w:style>
+  <w:style w:customStyle="1" w:styleId="Abstract" w:type="paragraph">
+    <w:name w:val="Abstract"/>
+    <w:basedOn w:val="Normal"/>
+    <w:next w:val="BodyText"/>
+    <w:qFormat/>
+    <w:pPr>
+      <w:keepNext/>
+      <w:keepLines/>
+      <w:spacing w:after="300" w:before="100"/>
+    </w:pPr>
+    <w:rPr>
+      <w:sz w:val="20"/>
+      <w:szCs w:val="20"/>
+    </w:rPr>
+  </w:style>
+  <w:style w:styleId="Bibliography" w:type="paragraph">
+    <w:name w:val="Bibliography"/>
+    <w:basedOn w:val="Normal"/>
+    <w:next w:val="Bibliography"/>
+    <w:qFormat/>
+    <w:pPr/>
+    <w:rPr/>
+  </w:style>
+  <w:style w:styleId="Heading1" w:type="paragraph">
+    <w:name w:val="heading 1"/>
+    <w:basedOn w:val="Normal"/>
+    <w:next w:val="BodyText"/>
+    <w:link w:val="Heading1Char"/>
+    <w:uiPriority w:val="9"/>
+    <w:qFormat/>
+    <w:rsid w:val="00A10FD9"/>
+    <w:pPr>
+      <w:keepNext/>
+      <w:keepLines/>
+      <w:spacing w:after="80" w:before="360"/>
+      <w:outlineLvl w:val="0"/>
+    </w:pPr>
+    <w:rPr>
+      <w:rFonts w:asciiTheme="majorHAnsi" w:cstheme="majorBidi" w:eastAsiaTheme="majorEastAsia" w:hAnsiTheme="majorHAnsi"/>
+      <w:color w:themeColor="accent1" w:themeShade="BF" w:val="0F4761"/>
+      <w:sz w:val="40"/>
+      <w:szCs w:val="40"/>
+    </w:rPr>
+  </w:style>
+  <w:style w:styleId="Heading2" w:type="paragraph">
+    <w:name w:val="heading 2"/>
+    <w:basedOn w:val="Normal"/>
+    <w:next w:val="BodyText"/>
+    <w:link w:val="Heading2Char"/>
+    <w:uiPriority w:val="9"/>
+    <w:semiHidden/>
+    <w:unhideWhenUsed/>
+    <w:qFormat/>
+    <w:rsid w:val="00A10FD9"/>
+    <w:pPr>
+      <w:keepNext/>
+      <w:keepLines/>
+      <w:spacing w:after="80" w:before="160"/>
+      <w:outlineLvl w:val="1"/>
+    </w:pPr>
+    <w:rPr>
+      <w:rFonts w:asciiTheme="majorHAnsi" w:cstheme="majorBidi" w:eastAsiaTheme="majorEastAsia" w:hAnsiTheme="majorHAnsi"/>
+      <w:color w:themeColor="accent1" w:themeShade="BF" w:val="0F4761"/>
+      <w:sz w:val="32"/>
+      <w:szCs w:val="32"/>
+    </w:rPr>
+  </w:style>
+  <w:style w:styleId="Heading3" w:type="paragraph">
+    <w:name w:val="heading 3"/>
+    <w:basedOn w:val="Normal"/>
+    <w:next w:val="BodyText"/>
+    <w:link w:val="Heading3Char"/>
+    <w:uiPriority w:val="9"/>
+    <w:semiHidden/>
+    <w:unhideWhenUsed/>
+    <w:qFormat/>
+    <w:rsid w:val="00A10FD9"/>
+    <w:pPr>
+      <w:keepNext/>
+      <w:keepLines/>
+      <w:spacing w:after="80" w:before="160"/>
+      <w:outlineLvl w:val="2"/>
+    </w:pPr>
+    <w:rPr>
+      <w:rFonts w:cstheme="majorBidi" w:eastAsiaTheme="majorEastAsia"/>
+      <w:color w:themeColor="accent1" w:themeShade="BF" w:val="0F4761"/>
+      <w:sz w:val="28"/>
+      <w:szCs w:val="28"/>
+    </w:rPr>
+  </w:style>
+  <w:style w:styleId="Heading4" w:type="paragraph">
+    <w:name w:val="heading 4"/>
+    <w:basedOn w:val="Normal"/>
+    <w:next w:val="BodyText"/>
+    <w:link w:val="Heading4Char"/>
+    <w:uiPriority w:val="9"/>
+    <w:semiHidden/>
+    <w:unhideWhenUsed/>
+    <w:qFormat/>
+    <w:rsid w:val="00A10FD9"/>
+    <w:pPr>
+      <w:keepNext/>
+      <w:keepLines/>
+      <w:spacing w:after="40" w:before="80"/>
+      <w:outlineLvl w:val="3"/>
+    </w:pPr>
+    <w:rPr>
+      <w:rFonts w:cstheme="majorBidi" w:eastAsiaTheme="majorEastAsia"/>
+      <w:i/>
+      <w:iCs/>
+      <w:color w:themeColor="accent1" w:themeShade="BF" w:val="0F4761"/>
+    </w:rPr>
+  </w:style>
+  <w:style w:styleId="Heading5" w:type="paragraph">
+    <w:name w:val="heading 5"/>
+    <w:basedOn w:val="Normal"/>
+    <w:next w:val="BodyText"/>
+    <w:link w:val="Heading5Char"/>
+    <w:uiPriority w:val="9"/>
+    <w:semiHidden/>
+    <w:unhideWhenUsed/>
+    <w:qFormat/>
+    <w:rsid w:val="00A10FD9"/>
+    <w:pPr>
+      <w:keepNext/>
+      <w:keepLines/>
+      <w:spacing w:after="40" w:before="80"/>
+      <w:outlineLvl w:val="4"/>
+    </w:pPr>
+    <w:rPr>
+      <w:rFonts w:cstheme="majorBidi" w:eastAsiaTheme="majorEastAsia"/>
+      <w:color w:themeColor="accent1" w:themeShade="BF" w:val="0F4761"/>
+    </w:rPr>
+  </w:style>
+  <w:style w:styleId="Heading6" w:type="paragraph">
+    <w:name w:val="heading 6"/>
+    <w:basedOn w:val="Normal"/>
+    <w:next w:val="BodyText"/>
+    <w:link w:val="Heading6Char"/>
+    <w:uiPriority w:val="9"/>
+    <w:semiHidden/>
+    <w:unhideWhenUsed/>
+    <w:qFormat/>
+    <w:rsid w:val="00A10FD9"/>
+    <w:pPr>
+      <w:keepNext/>
+      <w:keepLines/>
+      <w:spacing w:after="0" w:before="40"/>
+      <w:outlineLvl w:val="5"/>
+    </w:pPr>
+    <w:rPr>
+      <w:rFonts w:cstheme="majorBidi" w:eastAsiaTheme="majorEastAsia"/>
+      <w:i/>
+      <w:iCs/>
+      <w:color w:themeColor="text1" w:themeTint="A6" w:val="595959"/>
+    </w:rPr>
+  </w:style>
+  <w:style w:styleId="Heading7" w:type="paragraph">
+    <w:name w:val="heading 7"/>
+    <w:basedOn w:val="Normal"/>
+    <w:next w:val="BodyText"/>
+    <w:link w:val="Heading7Char"/>
+    <w:uiPriority w:val="9"/>
+    <w:semiHidden/>
+    <w:unhideWhenUsed/>
+    <w:qFormat/>
+    <w:rsid w:val="00A10FD9"/>
+    <w:pPr>
+      <w:keepNext/>
+      <w:keepLines/>
+      <w:spacing w:after="0" w:before="40"/>
+      <w:outlineLvl w:val="6"/>
+    </w:pPr>
+    <w:rPr>
+      <w:rFonts w:cstheme="majorBidi" w:eastAsiaTheme="majorEastAsia"/>
+      <w:color w:themeColor="text1" w:themeTint="A6" w:val="595959"/>
+    </w:rPr>
+  </w:style>
+  <w:style w:styleId="Heading8" w:type="paragraph">
+    <w:name w:val="heading 8"/>
+    <w:basedOn w:val="Normal"/>
+    <w:next w:val="BodyText"/>
+    <w:link w:val="Heading8Char"/>
+    <w:uiPriority w:val="9"/>
+    <w:semiHidden/>
+    <w:unhideWhenUsed/>
+    <w:qFormat/>
+    <w:rsid w:val="00A10FD9"/>
+    <w:pPr>
+      <w:keepNext/>
+      <w:keepLines/>
+      <w:spacing w:after="0"/>
+      <w:outlineLvl w:val="7"/>
+    </w:pPr>
+    <w:rPr>
+      <w:rFonts w:cstheme="majorBidi" w:eastAsiaTheme="majorEastAsia"/>
+      <w:i/>
+      <w:iCs/>
+      <w:color w:themeColor="text1" w:themeTint="D8" w:val="272727"/>
+    </w:rPr>
+  </w:style>
+  <w:style w:styleId="Heading9" w:type="paragraph">
+    <w:name w:val="heading 9"/>
+    <w:basedOn w:val="Normal"/>
+    <w:next w:val="BodyText"/>
+    <w:link w:val="Heading9Char"/>
+    <w:uiPriority w:val="9"/>
+    <w:semiHidden/>
+    <w:unhideWhenUsed/>
+    <w:qFormat/>
+    <w:rsid w:val="00A10FD9"/>
+    <w:pPr>
+      <w:keepNext/>
+      <w:keepLines/>
+      <w:spacing w:after="0"/>
+      <w:outlineLvl w:val="8"/>
+    </w:pPr>
+    <w:rPr>
+      <w:rFonts w:cstheme="majorBidi" w:eastAsiaTheme="majorEastAsia"/>
+      <w:color w:themeColor="text1" w:themeTint="D8" w:val="272727"/>
+    </w:rPr>
+  </w:style>
+  <w:style w:customStyle="1" w:styleId="Heading1Char" w:type="character">
+    <w:name w:val="Heading 1 Char"/>
+    <w:basedOn w:val="DefaultParagraphFont"/>
+    <w:link w:val="Heading1"/>
+    <w:uiPriority w:val="9"/>
+    <w:rsid w:val="00A10FD9"/>
+    <w:rPr>
+      <w:rFonts w:asciiTheme="majorHAnsi" w:cstheme="majorBidi" w:eastAsiaTheme="majorEastAsia" w:hAnsiTheme="majorHAnsi"/>
+      <w:color w:themeColor="accent1" w:themeShade="BF" w:val="0F4761"/>
+      <w:sz w:val="40"/>
+      <w:szCs w:val="40"/>
+    </w:rPr>
+  </w:style>
+  <w:style w:customStyle="1" w:styleId="Heading2Char" w:type="character">
+    <w:name w:val="Heading 2 Char"/>
+    <w:basedOn w:val="DefaultParagraphFont"/>
+    <w:link w:val="Heading2"/>
+    <w:uiPriority w:val="9"/>
+    <w:semiHidden/>
+    <w:rsid w:val="00A10FD9"/>
+    <w:rPr>
+      <w:rFonts w:asciiTheme="majorHAnsi" w:cstheme="majorBidi" w:eastAsiaTheme="majorEastAsia" w:hAnsiTheme="majorHAnsi"/>
+      <w:color w:themeColor="accent1" w:themeShade="BF" w:val="0F4761"/>
+      <w:sz w:val="32"/>
+      <w:szCs w:val="32"/>
+    </w:rPr>
+  </w:style>
+  <w:style w:customStyle="1" w:styleId="Heading3Char" w:type="character">
+    <w:name w:val="Heading 3 Char"/>
+    <w:basedOn w:val="DefaultParagraphFont"/>
+    <w:link w:val="Heading3"/>
+    <w:uiPriority w:val="9"/>
+    <w:semiHidden/>
+    <w:rsid w:val="00A10FD9"/>
+    <w:rPr>
+      <w:rFonts w:cstheme="majorBidi" w:eastAsiaTheme="majorEastAsia"/>
+      <w:color w:themeColor="accent1" w:themeShade="BF" w:val="0F4761"/>
+      <w:sz w:val="28"/>
+      <w:szCs w:val="28"/>
+    </w:rPr>
+  </w:style>
+  <w:style w:customStyle="1" w:styleId="Heading4Char" w:type="character">
+    <w:name w:val="Heading 4 Char"/>
+    <w:basedOn w:val="DefaultParagraphFont"/>
+    <w:link w:val="Heading4"/>
+    <w:uiPriority w:val="9"/>
+    <w:semiHidden/>
+    <w:rsid w:val="00A10FD9"/>
+    <w:rPr>
+      <w:rFonts w:cstheme="majorBidi" w:eastAsiaTheme="majorEastAsia"/>
+      <w:i/>
+      <w:iCs/>
+      <w:color w:themeColor="accent1" w:themeShade="BF" w:val="0F4761"/>
+    </w:rPr>
+  </w:style>
+  <w:style w:customStyle="1" w:styleId="Heading5Char" w:type="character">
+    <w:name w:val="Heading 5 Char"/>
+    <w:basedOn w:val="DefaultParagraphFont"/>
+    <w:link w:val="Heading5"/>
+    <w:uiPriority w:val="9"/>
+    <w:semiHidden/>
+    <w:rsid w:val="00A10FD9"/>
+    <w:rPr>
+      <w:rFonts w:cstheme="majorBidi" w:eastAsiaTheme="majorEastAsia"/>
+      <w:color w:themeColor="accent1" w:themeShade="BF" w:val="0F4761"/>
+    </w:rPr>
+  </w:style>
+  <w:style w:customStyle="1" w:styleId="Heading6Char" w:type="character">
+    <w:name w:val="Heading 6 Char"/>
+    <w:basedOn w:val="DefaultParagraphFont"/>
+    <w:link w:val="Heading6"/>
+    <w:uiPriority w:val="9"/>
+    <w:semiHidden/>
+    <w:rsid w:val="00A10FD9"/>
+    <w:rPr>
+      <w:rFonts w:cstheme="majorBidi" w:eastAsiaTheme="majorEastAsia"/>
+      <w:i/>
+      <w:iCs/>
+      <w:color w:themeColor="text1" w:themeTint="A6" w:val="595959"/>
+    </w:rPr>
+  </w:style>
+  <w:style w:customStyle="1" w:styleId="Heading7Char" w:type="character">
+    <w:name w:val="Heading 7 Char"/>
+    <w:basedOn w:val="DefaultParagraphFont"/>
+    <w:link w:val="Heading7"/>
+    <w:uiPriority w:val="9"/>
+    <w:semiHidden/>
+    <w:rsid w:val="00A10FD9"/>
+    <w:rPr>
+      <w:rFonts w:cstheme="majorBidi" w:eastAsiaTheme="majorEastAsia"/>
+      <w:color w:themeColor="text1" w:themeTint="A6" w:val="595959"/>
+    </w:rPr>
+  </w:style>
+  <w:style w:customStyle="1" w:styleId="Heading8Char" w:type="character">
+    <w:name w:val="Heading 8 Char"/>
+    <w:basedOn w:val="DefaultParagraphFont"/>
+    <w:link w:val="Heading8"/>
+    <w:uiPriority w:val="9"/>
+    <w:semiHidden/>
+    <w:rsid w:val="00A10FD9"/>
+    <w:rPr>
+      <w:rFonts w:cstheme="majorBidi" w:eastAsiaTheme="majorEastAsia"/>
+      <w:i/>
+      <w:iCs/>
+      <w:color w:themeColor="text1" w:themeTint="D8" w:val="272727"/>
+    </w:rPr>
+  </w:style>
+  <w:style w:customStyle="1" w:styleId="Heading9Char" w:type="character">
+    <w:name w:val="Heading 9 Char"/>
+    <w:basedOn w:val="DefaultParagraphFont"/>
+    <w:link w:val="Heading9"/>
+    <w:uiPriority w:val="9"/>
+    <w:semiHidden/>
+    <w:rsid w:val="00A10FD9"/>
+    <w:rPr>
+      <w:rFonts w:cstheme="majorBidi" w:eastAsiaTheme="majorEastAsia"/>
+      <w:color w:themeColor="text1" w:themeTint="D8" w:val="272727"/>
+    </w:rPr>
+  </w:style>
+  <w:style w:styleId="BlockText" w:type="paragraph">
+    <w:name w:val="Block Text"/>
+    <w:basedOn w:val="BodyText"/>
+    <w:next w:val="BodyText"/>
+    <w:uiPriority w:val="9"/>
+    <w:unhideWhenUsed/>
+    <w:qFormat/>
+    <w:pPr>
+      <w:spacing w:after="100" w:before="100"/>
+      <w:ind w:firstLine="0" w:left="480" w:right="480"/>
+    </w:pPr>
+  </w:style>
+  <w:style w:styleId="FootnoteText" w:type="paragraph">
+    <w:name w:val="Footnote Text"/>
+    <w:basedOn w:val="Normal"/>
+    <w:next w:val="FootnoteText"/>
+    <w:uiPriority w:val="9"/>
+    <w:unhideWhenUsed/>
+    <w:qFormat/>
+  </w:style>
+  <w:style w:styleId="FootnoteBlockText" w:type="paragraph">
+    <w:name w:val="Footnote Block Text"/>
+    <w:basedOn w:val="FootnoteText"/>
+    <w:next w:val="FootnoteText"/>
+    <w:uiPriority w:val="9"/>
+    <w:unhideWhenUsed/>
+    <w:qFormat/>
+    <w:pPr>
+      <w:spacing w:after="100" w:before="100"/>
+      <w:ind w:firstLine="0" w:left="480" w:right="480"/>
+    </w:pPr>
+  </w:style>
+  <w:style w:default="1" w:styleId="DefaultParagraphFont" w:type="character">
+    <w:name w:val="Default Paragraph Font"/>
+    <w:semiHidden/>
+    <w:unhideWhenUsed/>
+  </w:style>
+  <w:style w:default="1" w:styleId="Table" w:type="table">
+    <w:name w:val="Table"/>
+    <w:basedOn w:val="TableNormal"/>
+    <w:semiHidden/>
+    <w:unhideWhenUsed/>
+    <w:qFormat/>
+    <w:tblPr>
+      <w:tblInd w:type="dxa" w:w="0"/>
+      <w:tblCellMar>
+        <w:top w:type="dxa" w:w="0"/>
+        <w:left w:type="dxa" w:w="108"/>
+        <w:bottom w:type="dxa" w:w="0"/>
+        <w:right w:type="dxa" w:w="108"/>
+      </w:tblCellMar>
+    </w:tblPr>
+    <w:tblStylePr w:type="firstRow">
+      <w:tcPr>
+        <w:tcBorders>
+          <w:bottom w:val="single"/>
+        </w:tcBorders>
+        <w:vAlign w:val="bottom"/>
+      </w:tcPr>
+    </w:tblStylePr>
+  </w:style>
+  <w:style w:customStyle="1" w:styleId="DefinitionTerm" w:type="paragraph">
+    <w:name w:val="Definition Term"/>
+    <w:basedOn w:val="Normal"/>
+    <w:next w:val="Definition"/>
+    <w:pPr>
+      <w:keepNext/>
+      <w:keepLines/>
+      <w:spacing w:after="0"/>
+    </w:pPr>
+    <w:rPr>
+      <w:b/>
+    </w:rPr>
+  </w:style>
+  <w:style w:customStyle="1" w:styleId="Definition" w:type="paragraph">
+    <w:name w:val="Definition"/>
+    <w:basedOn w:val="Normal"/>
+  </w:style>
+  <w:style w:styleId="Caption" w:type="paragraph">
+    <w:name w:val="Caption"/>
+    <w:basedOn w:val="Normal"/>
+    <w:link w:val="BodyTextChar"/>
+    <w:pPr>
+      <w:spacing w:after="120" w:before="0"/>
+    </w:pPr>
+    <w:rPr>
+      <w:i/>
+    </w:rPr>
+  </w:style>
+  <w:style w:customStyle="1" w:styleId="TableCaption" w:type="paragraph">
+    <w:name w:val="Table Caption"/>
+    <w:basedOn w:val="Caption"/>
+    <w:pPr>
+      <w:keepNext/>
+    </w:pPr>
+  </w:style>
+  <w:style w:customStyle="1" w:styleId="ImageCaption" w:type="paragraph">
+    <w:name w:val="Image Caption"/>
+    <w:basedOn w:val="Caption"/>
+  </w:style>
+  <w:style w:customStyle="1" w:styleId="Figure" w:type="paragraph">
+    <w:name w:val="Figure"/>
+    <w:basedOn w:val="Normal"/>
+  </w:style>
+  <w:style w:customStyle="1" w:styleId="CaptionedFigure" w:type="paragraph">
+    <w:name w:val="Captioned Figure"/>
+    <w:basedOn w:val="Figure"/>
+    <w:pPr>
+      <w:keepNext/>
+    </w:pPr>
+  </w:style>
+  <w:style w:customStyle="1" w:styleId="BodyTextChar" w:type="character">
+    <w:name w:val="Body Text Char"/>
+    <w:basedOn w:val="DefaultParagraphFont"/>
+    <w:link w:val="BodyText"/>
+  </w:style>
+  <w:style w:customStyle="1" w:styleId="VerbatimChar" w:type="character">
+    <w:name w:val="Verbatim Char"/>
+    <w:basedOn w:val="BodyTextChar"/>
+    <w:rPr>
+      <w:rFonts w:ascii="Consolas" w:hAnsi="Consolas"/>
+      <w:sz w:val="22"/>
+    </w:rPr>
+  </w:style>
+  <w:style w:customStyle="1" w:styleId="SectionNumber" w:type="character">
+    <w:name w:val="Section Number"/>
+    <w:basedOn w:val="BodyTextChar"/>
+  </w:style>
+  <w:style w:styleId="FootnoteReference" w:type="character">
+    <w:name w:val="Footnote Reference"/>
+    <w:basedOn w:val="BodyTextChar"/>
+    <w:rPr>
+      <w:vertAlign w:val="superscript"/>
+    </w:rPr>
+  </w:style>
+  <w:style w:styleId="Hyperlink" w:type="character">
+    <w:name w:val="Hyperlink"/>
+    <w:basedOn w:val="BodyTextChar"/>
+    <w:rPr>
+      <w:color w:themeColor="accent1" w:val="4F81BD"/>
+    </w:rPr>
+  </w:style>
+  <w:style w:styleId="TOCHeading" w:type="paragraph">
+    <w:name w:val="TOC Heading"/>
+    <w:basedOn w:val="Heading1"/>
+    <w:next w:val="BodyText"/>
+    <w:uiPriority w:val="39"/>
+    <w:unhideWhenUsed/>
+    <w:qFormat/>
+    <w:pPr>
+      <w:spacing w:before="240" w:line="259" w:lineRule="auto"/>
+      <w:outlineLvl w:val="9"/>
+    </w:pPr>
+    <w:rPr>
+      <w:rFonts w:asciiTheme="majorHAnsi" w:cstheme="majorBidi" w:eastAsiaTheme="majorEastAsia" w:hAnsiTheme="majorHAnsi"/>
+      <w:b w:val="0"/>
+      <w:bCs w:val="0"/>
+      <w:color w:themeColor="accent1" w:themeShade="BF" w:val="365F91"/>
+    </w:rPr>
+  </w:style>
+  <w:style w:type="paragraph" w:customStyle="1" w:styleId="SourceCode">
+    <w:name w:val="Source Code"/>
+    <w:basedOn w:val="Normal"/>
+    <w:link w:val="VerbatimChar"/>
+    <w:pPr>
+      <w:wordWrap w:val="off"/>
+    </w:pPr>
+  </w:style>
+  <w:style w:type="character" w:customStyle="1" w:styleId="KeywordTok">
+    <w:name w:val="KeywordTok"/>
+    <w:basedOn w:val="VerbatimChar"/>
+    <w:rPr>
+      <w:b/>
+      <w:color w:val="007020"/>
+    </w:rPr>
+  </w:style>
+  <w:style w:type="character" w:customStyle="1" w:styleId="DataTypeTok">
+    <w:name w:val="DataTypeTok"/>
+    <w:basedOn w:val="VerbatimChar"/>
+    <w:rPr>
+      <w:color w:val="902000"/>
+    </w:rPr>
+  </w:style>
+  <w:style w:type="character" w:customStyle="1" w:styleId="DecValTok">
+    <w:name w:val="DecValTok"/>
+    <w:basedOn w:val="VerbatimChar"/>
+    <w:rPr>
+      <w:color w:val="40a070"/>
+    </w:rPr>
+  </w:style>
+  <w:style w:type="character" w:customStyle="1" w:styleId="BaseNTok">
+    <w:name w:val="BaseNTok"/>
+    <w:basedOn w:val="VerbatimChar"/>
+    <w:rPr>
+      <w:color w:val="40a070"/>
+    </w:rPr>
+  </w:style>
+  <w:style w:type="character" w:customStyle="1" w:styleId="FloatTok">
+    <w:name w:val="FloatTok"/>
+    <w:basedOn w:val="VerbatimChar"/>
+    <w:rPr>
+      <w:color w:val="40a070"/>
+    </w:rPr>
+  </w:style>
+  <w:style w:type="character" w:customStyle="1" w:styleId="ConstantTok">
+    <w:name w:val="ConstantTok"/>
+    <w:basedOn w:val="VerbatimChar"/>
+    <w:rPr>
+      <w:color w:val="880000"/>
+    </w:rPr>
+  </w:style>
+  <w:style w:type="character" w:customStyle="1" w:styleId="CharTok">
+    <w:name w:val="CharTok"/>
+    <w:basedOn w:val="VerbatimChar"/>
+    <w:rPr>
+      <w:color w:val="4070a0"/>
+    </w:rPr>
+  </w:style>
+  <w:style w:type="character" w:customStyle="1" w:styleId="SpecialCharTok">
+    <w:name w:val="SpecialCharTok"/>
+    <w:basedOn w:val="VerbatimChar"/>
+    <w:rPr>
+      <w:color w:val="4070a0"/>
+    </w:rPr>
+  </w:style>
+  <w:style w:type="character" w:customStyle="1" w:styleId="StringTok">
+    <w:name w:val="StringTok"/>
+    <w:basedOn w:val="VerbatimChar"/>
+    <w:rPr>
+      <w:color w:val="4070a0"/>
+    </w:rPr>
+  </w:style>
+  <w:style w:type="character" w:customStyle="1" w:styleId="VerbatimStringTok">
+    <w:name w:val="VerbatimStringTok"/>
+    <w:basedOn w:val="VerbatimChar"/>
+    <w:rPr>
+      <w:color w:val="4070a0"/>
+    </w:rPr>
+  </w:style>
+  <w:style w:type="character" w:customStyle="1" w:styleId="SpecialStringTok">
+    <w:name w:val="SpecialStringTok"/>
+    <w:basedOn w:val="VerbatimChar"/>
+    <w:rPr>
+      <w:color w:val="bb6688"/>
+    </w:rPr>
+  </w:style>
+  <w:style w:type="character" w:customStyle="1" w:styleId="ImportTok">
+    <w:name w:val="ImportTok"/>
+    <w:basedOn w:val="VerbatimChar"/>
+    <w:rPr>
+      <w:b/>
+      <w:color w:val="008000"/>
+    </w:rPr>
+  </w:style>
+  <w:style w:type="character" w:customStyle="1" w:styleId="CommentTok">
+    <w:name w:val="CommentTok"/>
+    <w:basedOn w:val="VerbatimChar"/>
+    <w:rPr>
+      <w:i/>
+      <w:color w:val="60a0b0"/>
+    </w:rPr>
+  </w:style>
+  <w:style w:type="character" w:customStyle="1" w:styleId="DocumentationTok">
+    <w:name w:val="DocumentationTok"/>
+    <w:basedOn w:val="VerbatimChar"/>
+    <w:rPr>
+      <w:i/>
+      <w:color w:val="ba2121"/>
+    </w:rPr>
+  </w:style>
+  <w:style w:type="character" w:customStyle="1" w:styleId="AnnotationTok">
+    <w:name w:val="AnnotationTok"/>
+    <w:basedOn w:val="VerbatimChar"/>
+    <w:rPr>
+      <w:b/>
+      <w:i/>
+      <w:color w:val="60a0b0"/>
+    </w:rPr>
+  </w:style>
+  <w:style w:type="character" w:customStyle="1" w:styleId="CommentVarTok">
+    <w:name w:val="CommentVarTok"/>
+    <w:basedOn w:val="VerbatimChar"/>
+    <w:rPr>
+      <w:b/>
+      <w:i/>
+      <w:color w:val="60a0b0"/>
+    </w:rPr>
+  </w:style>
+  <w:style w:type="character" w:customStyle="1" w:styleId="OtherTok">
+    <w:name w:val="OtherTok"/>
+    <w:basedOn w:val="VerbatimChar"/>
+    <w:rPr>
+      <w:color w:val="007020"/>
+    </w:rPr>
+  </w:style>
+  <w:style w:type="character" w:customStyle="1" w:styleId="FunctionTok">
+    <w:name w:val="FunctionTok"/>
+    <w:basedOn w:val="VerbatimChar"/>
+    <w:rPr>
+      <w:color w:val="06287e"/>
+    </w:rPr>
+  </w:style>
+  <w:style w:type="character" w:customStyle="1" w:styleId="VariableTok">
+    <w:name w:val="VariableTok"/>
+    <w:basedOn w:val="VerbatimChar"/>
+    <w:rPr>
+      <w:color w:val="19177c"/>
+    </w:rPr>
+  </w:style>
+  <w:style w:type="character" w:customStyle="1" w:styleId="ControlFlowTok">
+    <w:name w:val="ControlFlowTok"/>
+    <w:basedOn w:val="VerbatimChar"/>
+    <w:rPr>
+      <w:b/>
+      <w:color w:val="007020"/>
+    </w:rPr>
+  </w:style>
+  <w:style w:type="character" w:customStyle="1" w:styleId="OperatorTok">
+    <w:name w:val="OperatorTok"/>
+    <w:basedOn w:val="VerbatimChar"/>
+    <w:rPr>
+      <w:color w:val="666666"/>
+    </w:rPr>
+  </w:style>
+  <w:style w:type="character" w:customStyle="1" w:styleId="BuiltInTok">
+    <w:name w:val="BuiltInTok"/>
+    <w:basedOn w:val="VerbatimChar"/>
+    <w:rPr>
+      <w:color w:val="008000"/>
+    </w:rPr>
+  </w:style>
+  <w:style w:type="character" w:customStyle="1" w:styleId="ExtensionTok">
+    <w:name w:val="ExtensionTok"/>
+    <w:basedOn w:val="VerbatimChar"/>
+    <w:rPr/>
+  </w:style>
+  <w:style w:type="character" w:customStyle="1" w:styleId="PreprocessorTok">
+    <w:name w:val="PreprocessorTok"/>
+    <w:basedOn w:val="VerbatimChar"/>
+    <w:rPr>
+      <w:color w:val="bc7a00"/>
+    </w:rPr>
+  </w:style>
+  <w:style w:type="character" w:customStyle="1" w:styleId="AttributeTok">
+    <w:name w:val="AttributeTok"/>
+    <w:basedOn w:val="VerbatimChar"/>
+    <w:rPr>
+      <w:color w:val="7d9029"/>
+    </w:rPr>
+  </w:style>
+  <w:style w:type="character" w:customStyle="1" w:styleId="RegionMarkerTok">
+    <w:name w:val="RegionMarkerTok"/>
+    <w:basedOn w:val="VerbatimChar"/>
+    <w:rPr/>
+  </w:style>
+  <w:style w:type="character" w:customStyle="1" w:styleId="InformationTok">
+    <w:name w:val="InformationTok"/>
+    <w:basedOn w:val="VerbatimChar"/>
+    <w:rPr>
+      <w:b/>
+      <w:i/>
+      <w:color w:val="60a0b0"/>
+    </w:rPr>
+  </w:style>
+  <w:style w:type="character" w:customStyle="1" w:styleId="WarningTok">
+    <w:name w:val="WarningTok"/>
+    <w:basedOn w:val="VerbatimChar"/>
+    <w:rPr>
+      <w:b/>
+      <w:i/>
+      <w:color w:val="60a0b0"/>
+    </w:rPr>
+  </w:style>
+  <w:style w:type="character" w:customStyle="1" w:styleId="AlertTok">
+    <w:name w:val="AlertTok"/>
+    <w:basedOn w:val="VerbatimChar"/>
+    <w:rPr>
+      <w:b/>
+      <w:color w:val="ff0000"/>
+    </w:rPr>
+  </w:style>
+  <w:style w:type="character" w:customStyle="1" w:styleId="ErrorTok">
+    <w:name w:val="ErrorTok"/>
+    <w:basedOn w:val="VerbatimChar"/>
+    <w:rPr>
+      <w:b/>
+      <w:color w:val="ff0000"/>
+    </w:rPr>
+  </w:style>
+  <w:style w:type="character" w:customStyle="1" w:styleId="NormalTok">
+    <w:name w:val="NormalTok"/>
+    <w:basedOn w:val="VerbatimChar"/>
+    <w:rPr/>
+  </w:style>
+</w:styles>
 </file>
 
 <file path=word/theme/theme1.xml><?xml version="1.0" encoding="utf-8"?>

</xml_diff>